<commit_message>
Revert "Merge branch 'main' of https://github.com/Papyrine/OpenXmlHtml"
This reverts commit 1b3e35383cc43888b252029232146c9cbfd88d64, reversing
changes made to f5de33b4e67dd933757e84c7e92afb17dabc1020.
</commit_message>
<xml_diff>
--- a/src/OpenXmlHtml.Tests/Samples/WordSamples.EmployeeOnboardingGuide.DotNet.verified.docx
+++ b/src/OpenXmlHtml.Tests/Samples/WordSamples.EmployeeOnboardingGuide.DotNet.verified.docx
@@ -388,6 +388,9 @@
     </w:p>
     <w:p>
       <w:r>
+        <w:t xml:space="preserve"> </w:t>
+      </w:r>
+      <w:r>
         <w:t xml:space="preserve">“</w:t>
       </w:r>
       <w:r>
@@ -397,7 +400,7 @@
         <w:t xml:space="preserve">”</w:t>
       </w:r>
       <w:r>
-        <w:t xml:space="preserve"> — Phil Jackson</w:t>
+        <w:t xml:space="preserve"> — Phil Jackson </w:t>
       </w:r>
     </w:p>
     <w:p>

</xml_diff>